<commit_message>
feat: implement document re-upload component and initialize login authentication page
</commit_message>
<xml_diff>
--- a/public/agreements/client_agreement.docx
+++ b/public/agreements/client_agreement.docx
@@ -1,6 +1,6 @@
 
 <file path=word/document.xml><?xml version="1.0" encoding="utf-8"?>
-<w:document xmlns:wpc="http://schemas.microsoft.com/office/word/2010/wordprocessingCanvas" xmlns:cx="http://schemas.microsoft.com/office/drawing/2014/chartex" xmlns:cx1="http://schemas.microsoft.com/office/drawing/2015/9/8/chartex" xmlns:cx2="http://schemas.microsoft.com/office/drawing/2015/10/21/chartex" xmlns:cx3="http://schemas.microsoft.com/office/drawing/2016/5/9/chartex" xmlns:cx4="http://schemas.microsoft.com/office/drawing/2016/5/10/chartex" xmlns:cx5="http://schemas.microsoft.com/office/drawing/2016/5/11/chartex" xmlns:cx6="http://schemas.microsoft.com/office/drawing/2016/5/12/chartex" xmlns:cx7="http://schemas.microsoft.com/office/drawing/2016/5/13/chartex" xmlns:cx8="http://schemas.microsoft.com/office/drawing/2016/5/14/chartex" xmlns:mc="http://schemas.openxmlformats.org/markup-compatibility/2006" xmlns:aink="http://schemas.microsoft.com/office/drawing/2016/ink" xmlns:am3d="http://schemas.microsoft.com/office/drawing/2017/model3d" xmlns:o="urn:schemas-microsoft-com:office:office" xmlns:oel="http://schemas.microsoft.com/office/2019/extlst" xmlns:r="http://schemas.openxmlformats.org/officeDocument/2006/relationships" xmlns:m="http://schemas.openxmlformats.org/officeDocument/2006/math" xmlns:v="urn:schemas-microsoft-com:vml" xmlns:wp14="http://schemas.microsoft.com/office/word/2010/wordprocessingDrawing" xmlns:wp="http://schemas.openxmlformats.org/drawingml/2006/wordprocessingDrawing" xmlns:w10="urn:schemas-microsoft-com:office:word" xmlns:w="http://schemas.openxmlformats.org/wordprocessingml/2006/main" xmlns:w14="http://schemas.microsoft.com/office/word/2010/wordml" xmlns:w15="http://schemas.microsoft.com/office/word/2012/wordml" xmlns:w16cex="http://schemas.microsoft.com/office/word/2018/wordml/cex" xmlns:w16cid="http://schemas.microsoft.com/office/word/2016/wordml/cid" xmlns:w16="http://schemas.microsoft.com/office/word/2018/wordml" xmlns:w16du="http://schemas.microsoft.com/office/word/2023/wordml/word16du" xmlns:w16sdtdh="http://schemas.microsoft.com/office/word/2020/wordml/sdtdatahash" xmlns:w16sdtfl="http://schemas.microsoft.com/office/word/2024/wordml/sdtformatlock" xmlns:w16se="http://schemas.microsoft.com/office/word/2015/wordml/symex" xmlns:wpg="http://schemas.microsoft.com/office/word/2010/wordprocessingGroup" xmlns:wpi="http://schemas.microsoft.com/office/word/2010/wordprocessingInk" xmlns:wne="http://schemas.microsoft.com/office/word/2006/wordml" xmlns:wps="http://schemas.microsoft.com/office/word/2010/wordprocessingShape" mc:Ignorable="w14 w15 w16se w16cid w16 w16cex w16sdtdh w16sdtfl w16du wp14">
+<w:document xmlns:wpc="http://schemas.microsoft.com/office/word/2010/wordprocessingCanvas" xmlns:cx="http://schemas.microsoft.com/office/drawing/2014/chartex" xmlns:cx1="http://schemas.microsoft.com/office/drawing/2015/9/8/chartex" xmlns:cx2="http://schemas.microsoft.com/office/drawing/2015/10/21/chartex" xmlns:cx3="http://schemas.microsoft.com/office/drawing/2016/5/9/chartex" xmlns:cx4="http://schemas.microsoft.com/office/drawing/2016/5/10/chartex" xmlns:cx5="http://schemas.microsoft.com/office/drawing/2016/5/11/chartex" xmlns:cx6="http://schemas.microsoft.com/office/drawing/2016/5/12/chartex" xmlns:cx7="http://schemas.microsoft.com/office/drawing/2016/5/13/chartex" xmlns:cx8="http://schemas.microsoft.com/office/drawing/2016/5/14/chartex" xmlns:mc="http://schemas.openxmlformats.org/markup-compatibility/2006" xmlns:aink="http://schemas.microsoft.com/office/drawing/2016/ink" xmlns:am3d="http://schemas.microsoft.com/office/drawing/2017/model3d" xmlns:o="urn:schemas-microsoft-com:office:office" xmlns:oel="http://schemas.microsoft.com/office/2019/extlst" xmlns:r="http://schemas.openxmlformats.org/officeDocument/2006/relationships" xmlns:m="http://schemas.openxmlformats.org/officeDocument/2006/math" xmlns:v="urn:schemas-microsoft-com:vml" xmlns:wp14="http://schemas.microsoft.com/office/word/2010/wordprocessingDrawing" xmlns:wp="http://schemas.openxmlformats.org/drawingml/2006/wordprocessingDrawing" xmlns:w10="urn:schemas-microsoft-com:office:word" xmlns:w="http://schemas.openxmlformats.org/wordprocessingml/2006/main" xmlns:w14="http://schemas.microsoft.com/office/word/2010/wordml" xmlns:w15="http://schemas.microsoft.com/office/word/2012/wordml" xmlns:w16cei="http://schemas.microsoft.com/office/word/2026/wordml/cei" xmlns:w16cex="http://schemas.microsoft.com/office/word/2018/wordml/cex" xmlns:w16cid="http://schemas.microsoft.com/office/word/2016/wordml/cid" xmlns:w16="http://schemas.microsoft.com/office/word/2018/wordml" xmlns:w16du="http://schemas.microsoft.com/office/word/2023/wordml/word16du" xmlns:w16sdtdh="http://schemas.microsoft.com/office/word/2020/wordml/sdtdatahash" xmlns:w16sdtfl="http://schemas.microsoft.com/office/word/2024/wordml/sdtformatlock" xmlns:w16se="http://schemas.microsoft.com/office/word/2015/wordml/symex" xmlns:wpg="http://schemas.microsoft.com/office/word/2010/wordprocessingGroup" xmlns:wpi="http://schemas.microsoft.com/office/word/2010/wordprocessingInk" xmlns:wne="http://schemas.microsoft.com/office/word/2006/wordml" xmlns:wps="http://schemas.microsoft.com/office/word/2010/wordprocessingShape" mc:Ignorable="w14 w15 w16se w16cid w16 w16cex w16sdtdh w16sdtfl w16du wp14">
   <w:body>
     <w:p>
       <w:pPr>
@@ -29,6 +29,8 @@
         <w:jc w:val="both"/>
         <w:rPr>
           <w:rFonts w:ascii="Times New Roman" w:hAnsi="Times New Roman" w:cs="Times New Roman"/>
+          <w:b/>
+          <w:bCs/>
           <w:sz w:val="20"/>
           <w:szCs w:val="20"/>
         </w:rPr>
@@ -41,18 +43,28 @@
           <w:sz w:val="20"/>
           <w:szCs w:val="20"/>
         </w:rPr>
-        <w:t>(Production &amp; Pre-Production Financing – India)</w:t>
-      </w:r>
-    </w:p>
-    <w:p>
-      <w:pPr>
-        <w:jc w:val="both"/>
-        <w:rPr>
-          <w:rFonts w:ascii="Times New Roman" w:hAnsi="Times New Roman" w:cs="Times New Roman"/>
-          <w:sz w:val="20"/>
-          <w:szCs w:val="20"/>
-        </w:rPr>
-      </w:pPr>
+        <w:t>(Production &amp; Pre-Production Financing – India</w:t>
+      </w:r>
+    </w:p>
+    <w:p>
+      <w:pPr>
+        <w:jc w:val="both"/>
+        <w:rPr>
+          <w:rFonts w:ascii="Times New Roman" w:hAnsi="Times New Roman" w:cs="Times New Roman"/>
+          <w:sz w:val="20"/>
+          <w:szCs w:val="20"/>
+        </w:rPr>
+      </w:pPr>
+      <w:r>
+        <w:rPr>
+          <w:rFonts w:ascii="Times New Roman" w:hAnsi="Times New Roman" w:cs="Times New Roman"/>
+          <w:b/>
+          <w:bCs/>
+          <w:sz w:val="20"/>
+          <w:szCs w:val="20"/>
+        </w:rPr>
+        <w:br/>
+      </w:r>
       <w:r>
         <w:rPr>
           <w:rFonts w:ascii="Times New Roman" w:hAnsi="Times New Roman" w:cs="Times New Roman"/>
@@ -137,62 +149,61 @@
           <w:sz w:val="20"/>
           <w:szCs w:val="20"/>
         </w:rPr>
-        <w:t>[Media Fund Name]</w:t>
-      </w:r>
-      <w:r>
-        <w:rPr>
-          <w:rFonts w:ascii="Times New Roman" w:hAnsi="Times New Roman" w:cs="Times New Roman"/>
-          <w:sz w:val="20"/>
-          <w:szCs w:val="20"/>
-        </w:rPr>
-        <w:t>, a [Private Limited Company / LLP] incorporated under the laws of India, having its registered office at __________________________ (“</w:t>
-      </w:r>
-      <w:r>
-        <w:rPr>
-          <w:rFonts w:ascii="Times New Roman" w:hAnsi="Times New Roman" w:cs="Times New Roman"/>
-          <w:b/>
-          <w:bCs/>
-          <w:sz w:val="20"/>
-          <w:szCs w:val="20"/>
-        </w:rPr>
-        <w:t>Media Platform</w:t>
-      </w:r>
-      <w:r>
-        <w:rPr>
-          <w:rFonts w:ascii="Times New Roman" w:hAnsi="Times New Roman" w:cs="Times New Roman"/>
-          <w:sz w:val="20"/>
-          <w:szCs w:val="20"/>
-        </w:rPr>
-        <w:t>” or “</w:t>
-      </w:r>
-      <w:r>
-        <w:rPr>
-          <w:rFonts w:ascii="Times New Roman" w:hAnsi="Times New Roman" w:cs="Times New Roman"/>
-          <w:b/>
-          <w:bCs/>
-          <w:sz w:val="20"/>
-          <w:szCs w:val="20"/>
-        </w:rPr>
-        <w:t>Company</w:t>
-      </w:r>
-      <w:r>
-        <w:rPr>
-          <w:rFonts w:ascii="Times New Roman" w:hAnsi="Times New Roman" w:cs="Times New Roman"/>
-          <w:sz w:val="20"/>
-          <w:szCs w:val="20"/>
-        </w:rPr>
-        <w:t>”</w:t>
-      </w:r>
-      <w:proofErr w:type="gramStart"/>
-      <w:r>
-        <w:rPr>
-          <w:rFonts w:ascii="Times New Roman" w:hAnsi="Times New Roman" w:cs="Times New Roman"/>
-          <w:sz w:val="20"/>
-          <w:szCs w:val="20"/>
-        </w:rPr>
-        <w:t>);</w:t>
-      </w:r>
-      <w:proofErr w:type="gramEnd"/>
+        <w:br/>
+      </w:r>
+      <w:r>
+        <w:rPr>
+          <w:rFonts w:ascii="Times New Roman" w:hAnsi="Times New Roman" w:cs="Times New Roman"/>
+          <w:b/>
+          <w:bCs/>
+          <w:sz w:val="20"/>
+          <w:szCs w:val="20"/>
+        </w:rPr>
+        <w:t xml:space="preserve">KINETOSCOPE FILMS PVT LTD </w:t>
+      </w:r>
+      <w:r>
+        <w:rPr>
+          <w:rFonts w:ascii="Times New Roman" w:hAnsi="Times New Roman" w:cs="Times New Roman"/>
+          <w:sz w:val="20"/>
+          <w:szCs w:val="20"/>
+        </w:rPr>
+        <w:t>(CIN is U59141MH2025PTC438600 ) a company incorporated in India under the Companies Act , 2013 ( 18 of 2013 ) by Limited its shares having PAN No. AALCK5262H and having its registered address at  C 101 , 1</w:t>
+      </w:r>
+      <w:r>
+        <w:rPr>
+          <w:rFonts w:ascii="Times New Roman" w:hAnsi="Times New Roman" w:cs="Times New Roman"/>
+          <w:sz w:val="20"/>
+          <w:szCs w:val="20"/>
+          <w:vertAlign w:val="superscript"/>
+        </w:rPr>
+        <w:t>st</w:t>
+      </w:r>
+      <w:r>
+        <w:rPr>
+          <w:rFonts w:ascii="Times New Roman" w:hAnsi="Times New Roman" w:cs="Times New Roman"/>
+          <w:sz w:val="20"/>
+          <w:szCs w:val="20"/>
+        </w:rPr>
+        <w:t xml:space="preserve"> Floor , Nishit CHSL , M G Road , Kandivali West , Mumbai – 400067, India . (</w:t>
+      </w:r>
+      <w:r>
+        <w:rPr>
+          <w:rFonts w:ascii="Times New Roman" w:hAnsi="Times New Roman" w:cs="Times New Roman"/>
+          <w:b/>
+          <w:bCs/>
+          <w:sz w:val="20"/>
+          <w:szCs w:val="20"/>
+        </w:rPr>
+        <w:t>“Is now referred as The Company”</w:t>
+      </w:r>
+      <w:r>
+        <w:rPr>
+          <w:rFonts w:ascii="Times New Roman" w:hAnsi="Times New Roman" w:cs="Times New Roman"/>
+          <w:sz w:val="20"/>
+          <w:szCs w:val="20"/>
+        </w:rPr>
+        <w:t>)</w:t>
+      </w:r>
     </w:p>
     <w:p>
       <w:pPr>
@@ -727,18 +738,8 @@
           <w:sz w:val="20"/>
           <w:szCs w:val="20"/>
         </w:rPr>
-        <w:t xml:space="preserve"> constitute a Collective Investment Scheme under Section 11AA of the SEBI Act, </w:t>
-      </w:r>
-      <w:proofErr w:type="gramStart"/>
-      <w:r>
-        <w:rPr>
-          <w:rFonts w:ascii="Times New Roman" w:hAnsi="Times New Roman" w:cs="Times New Roman"/>
-          <w:sz w:val="20"/>
-          <w:szCs w:val="20"/>
-        </w:rPr>
-        <w:t>1992;</w:t>
-      </w:r>
-      <w:proofErr w:type="gramEnd"/>
+        <w:t xml:space="preserve"> constitute a Collective Investment Scheme under Section 11AA of the SEBI Act, 1992;</w:t>
+      </w:r>
     </w:p>
     <w:p>
       <w:pPr>
@@ -777,18 +778,8 @@
           <w:sz w:val="20"/>
           <w:szCs w:val="20"/>
         </w:rPr>
-        <w:t xml:space="preserve"> involve pooling of funds managed as a scheme or </w:t>
-      </w:r>
-      <w:proofErr w:type="gramStart"/>
-      <w:r>
-        <w:rPr>
-          <w:rFonts w:ascii="Times New Roman" w:hAnsi="Times New Roman" w:cs="Times New Roman"/>
-          <w:sz w:val="20"/>
-          <w:szCs w:val="20"/>
-        </w:rPr>
-        <w:t>fund;</w:t>
-      </w:r>
-      <w:proofErr w:type="gramEnd"/>
+        <w:t xml:space="preserve"> involve pooling of funds managed as a scheme or fund;</w:t>
+      </w:r>
     </w:p>
     <w:p>
       <w:pPr>
@@ -917,18 +908,7 @@
           <w:sz w:val="20"/>
           <w:szCs w:val="20"/>
         </w:rPr>
-        <w:t xml:space="preserve">private commercial </w:t>
-      </w:r>
-      <w:proofErr w:type="gramStart"/>
-      <w:r>
-        <w:rPr>
-          <w:rFonts w:ascii="Times New Roman" w:hAnsi="Times New Roman" w:cs="Times New Roman"/>
-          <w:b/>
-          <w:bCs/>
-          <w:sz w:val="20"/>
-          <w:szCs w:val="20"/>
-        </w:rPr>
-        <w:t>discussions</w:t>
+        <w:t>private commercial discussions</w:t>
       </w:r>
       <w:r>
         <w:rPr>
@@ -938,7 +918,6 @@
         </w:rPr>
         <w:t>;</w:t>
       </w:r>
-      <w:proofErr w:type="gramEnd"/>
     </w:p>
     <w:p>
       <w:pPr>
@@ -981,6 +960,7 @@
           <w:sz w:val="20"/>
           <w:szCs w:val="20"/>
         </w:rPr>
+        <w:lastRenderedPageBreak/>
         <w:t>independent assessment of commercial risks has been undertaken.</w:t>
       </w:r>
     </w:p>
@@ -1027,7 +1007,6 @@
           <w:sz w:val="20"/>
           <w:szCs w:val="20"/>
         </w:rPr>
-        <w:lastRenderedPageBreak/>
         <w:t>3. COOLING-OFF PERIOD</w:t>
       </w:r>
     </w:p>
@@ -1294,18 +1273,8 @@
           <w:sz w:val="20"/>
           <w:szCs w:val="20"/>
         </w:rPr>
-        <w:t xml:space="preserve">an assured or risk-free </w:t>
-      </w:r>
-      <w:proofErr w:type="gramStart"/>
-      <w:r>
-        <w:rPr>
-          <w:rFonts w:ascii="Times New Roman" w:hAnsi="Times New Roman" w:cs="Times New Roman"/>
-          <w:sz w:val="20"/>
-          <w:szCs w:val="20"/>
-        </w:rPr>
-        <w:t>investment;</w:t>
-      </w:r>
-      <w:proofErr w:type="gramEnd"/>
+        <w:t>an assured or risk-free investment;</w:t>
+      </w:r>
     </w:p>
     <w:p>
       <w:pPr>
@@ -1326,18 +1295,8 @@
           <w:sz w:val="20"/>
           <w:szCs w:val="20"/>
         </w:rPr>
-        <w:t xml:space="preserve">a lending or deposit </w:t>
-      </w:r>
-      <w:proofErr w:type="gramStart"/>
-      <w:r>
-        <w:rPr>
-          <w:rFonts w:ascii="Times New Roman" w:hAnsi="Times New Roman" w:cs="Times New Roman"/>
-          <w:sz w:val="20"/>
-          <w:szCs w:val="20"/>
-        </w:rPr>
-        <w:t>arrangement;</w:t>
-      </w:r>
-      <w:proofErr w:type="gramEnd"/>
+        <w:t>a lending or deposit arrangement;</w:t>
+      </w:r>
     </w:p>
     <w:p>
       <w:pPr>
@@ -1604,18 +1563,7 @@
           <w:sz w:val="20"/>
           <w:szCs w:val="20"/>
         </w:rPr>
-        <w:t xml:space="preserve">daily pro-rated </w:t>
-      </w:r>
-      <w:proofErr w:type="gramStart"/>
-      <w:r>
-        <w:rPr>
-          <w:rFonts w:ascii="Times New Roman" w:hAnsi="Times New Roman" w:cs="Times New Roman"/>
-          <w:b/>
-          <w:bCs/>
-          <w:sz w:val="20"/>
-          <w:szCs w:val="20"/>
-        </w:rPr>
-        <w:t>basis</w:t>
+        <w:t>daily pro-rated basis</w:t>
       </w:r>
       <w:r>
         <w:rPr>
@@ -1625,7 +1573,6 @@
         </w:rPr>
         <w:t>;</w:t>
       </w:r>
-      <w:proofErr w:type="gramEnd"/>
     </w:p>
     <w:p>
       <w:pPr>
@@ -1862,25 +1809,16 @@
           <w:sz w:val="20"/>
           <w:szCs w:val="20"/>
         </w:rPr>
-        <w:t xml:space="preserve">6.5 Where any Project funded (in whole or in part) using the Participation Amount achieves Net Profits After Tax for the Media Platform </w:t>
-      </w:r>
-      <w:proofErr w:type="gramStart"/>
-      <w:r>
-        <w:rPr>
-          <w:rFonts w:ascii="Times New Roman" w:hAnsi="Times New Roman" w:cs="Times New Roman"/>
-          <w:sz w:val="20"/>
-          <w:szCs w:val="20"/>
-        </w:rPr>
-        <w:t>in excess of</w:t>
-      </w:r>
-      <w:proofErr w:type="gramEnd"/>
-      <w:r>
-        <w:rPr>
-          <w:rFonts w:ascii="Times New Roman" w:hAnsi="Times New Roman" w:cs="Times New Roman"/>
-          <w:sz w:val="20"/>
-          <w:szCs w:val="20"/>
-        </w:rPr>
-        <w:t xml:space="preserve"> one hundred percent (100%) of the Gross Project Cost funded by the Media Platform for such Project, the Participating Party shall be eligible for an additional performance-linked commercial participation.</w:t>
+        <w:t xml:space="preserve">6.5 Where any Project funded (in whole or in part) using the Participation Amount achieves Net Profits After Tax for the Media Platform in excess of one hundred percent (100%) of the Gross Project Cost funded by the Media </w:t>
+      </w:r>
+      <w:r>
+        <w:rPr>
+          <w:rFonts w:ascii="Times New Roman" w:hAnsi="Times New Roman" w:cs="Times New Roman"/>
+          <w:sz w:val="20"/>
+          <w:szCs w:val="20"/>
+        </w:rPr>
+        <w:lastRenderedPageBreak/>
+        <w:t>Platform for such Project, the Participating Party shall be eligible for an additional performance-linked commercial participation.</w:t>
       </w:r>
     </w:p>
     <w:p>
@@ -1919,7 +1857,6 @@
           <w:sz w:val="20"/>
           <w:szCs w:val="20"/>
         </w:rPr>
-        <w:lastRenderedPageBreak/>
         <w:t>6.5.1 Such performance-linked participation shall be:</w:t>
       </w:r>
     </w:p>
@@ -2110,18 +2047,8 @@
           <w:sz w:val="20"/>
           <w:szCs w:val="20"/>
         </w:rPr>
-        <w:t xml:space="preserve"> upon actual realisation of Net Profits After </w:t>
-      </w:r>
-      <w:proofErr w:type="gramStart"/>
-      <w:r>
-        <w:rPr>
-          <w:rFonts w:ascii="Times New Roman" w:hAnsi="Times New Roman" w:cs="Times New Roman"/>
-          <w:sz w:val="20"/>
-          <w:szCs w:val="20"/>
-        </w:rPr>
-        <w:t>Tax;</w:t>
-      </w:r>
-      <w:proofErr w:type="gramEnd"/>
+        <w:t xml:space="preserve"> upon actual realisation of Net Profits After Tax;</w:t>
+      </w:r>
     </w:p>
     <w:p>
       <w:pPr>
@@ -2545,18 +2472,8 @@
           <w:sz w:val="20"/>
           <w:szCs w:val="20"/>
         </w:rPr>
-        <w:t xml:space="preserve">production cash flow </w:t>
-      </w:r>
-      <w:proofErr w:type="gramStart"/>
-      <w:r>
-        <w:rPr>
-          <w:rFonts w:ascii="Times New Roman" w:hAnsi="Times New Roman" w:cs="Times New Roman"/>
-          <w:sz w:val="20"/>
-          <w:szCs w:val="20"/>
-        </w:rPr>
-        <w:t>timing;</w:t>
-      </w:r>
-      <w:proofErr w:type="gramEnd"/>
+        <w:t>production cash flow timing;</w:t>
+      </w:r>
     </w:p>
     <w:p>
       <w:pPr>
@@ -2749,7 +2666,6 @@
           <w:szCs w:val="20"/>
         </w:rPr>
       </w:pPr>
-      <w:proofErr w:type="gramStart"/>
       <w:r>
         <w:rPr>
           <w:rFonts w:ascii="Times New Roman" w:hAnsi="Times New Roman" w:cs="Times New Roman"/>
@@ -2758,7 +2674,6 @@
         </w:rPr>
         <w:t>interest;</w:t>
       </w:r>
-      <w:proofErr w:type="gramEnd"/>
     </w:p>
     <w:p>
       <w:pPr>
@@ -2773,16 +2688,15 @@
           <w:szCs w:val="20"/>
         </w:rPr>
       </w:pPr>
-      <w:proofErr w:type="gramStart"/>
-      <w:r>
-        <w:rPr>
-          <w:rFonts w:ascii="Times New Roman" w:hAnsi="Times New Roman" w:cs="Times New Roman"/>
-          <w:sz w:val="20"/>
-          <w:szCs w:val="20"/>
-        </w:rPr>
+      <w:r>
+        <w:rPr>
+          <w:rFonts w:ascii="Times New Roman" w:hAnsi="Times New Roman" w:cs="Times New Roman"/>
+          <w:sz w:val="20"/>
+          <w:szCs w:val="20"/>
+        </w:rPr>
+        <w:lastRenderedPageBreak/>
         <w:t>penalty;</w:t>
       </w:r>
-      <w:proofErr w:type="gramEnd"/>
     </w:p>
     <w:p>
       <w:pPr>
@@ -2859,7 +2773,6 @@
           <w:sz w:val="20"/>
           <w:szCs w:val="20"/>
         </w:rPr>
-        <w:lastRenderedPageBreak/>
         <w:t>9. MANAGEMENT &amp; CONTROL</w:t>
       </w:r>
     </w:p>
@@ -2918,18 +2831,8 @@
           <w:sz w:val="20"/>
           <w:szCs w:val="20"/>
         </w:rPr>
-        <w:t xml:space="preserve">project </w:t>
-      </w:r>
-      <w:proofErr w:type="gramStart"/>
-      <w:r>
-        <w:rPr>
-          <w:rFonts w:ascii="Times New Roman" w:hAnsi="Times New Roman" w:cs="Times New Roman"/>
-          <w:sz w:val="20"/>
-          <w:szCs w:val="20"/>
-        </w:rPr>
-        <w:t>selection;</w:t>
-      </w:r>
-      <w:proofErr w:type="gramEnd"/>
+        <w:t>project selection;</w:t>
+      </w:r>
     </w:p>
     <w:p>
       <w:pPr>
@@ -2950,18 +2853,8 @@
           <w:sz w:val="20"/>
           <w:szCs w:val="20"/>
         </w:rPr>
-        <w:t xml:space="preserve">budgets and </w:t>
-      </w:r>
-      <w:proofErr w:type="gramStart"/>
-      <w:r>
-        <w:rPr>
-          <w:rFonts w:ascii="Times New Roman" w:hAnsi="Times New Roman" w:cs="Times New Roman"/>
-          <w:sz w:val="20"/>
-          <w:szCs w:val="20"/>
-        </w:rPr>
-        <w:t>timelines;</w:t>
-      </w:r>
-      <w:proofErr w:type="gramEnd"/>
+        <w:t>budgets and timelines;</w:t>
+      </w:r>
     </w:p>
     <w:p>
       <w:pPr>
@@ -3524,6 +3417,7 @@
           <w:sz w:val="20"/>
           <w:szCs w:val="20"/>
         </w:rPr>
+        <w:lastRenderedPageBreak/>
         <w:t>15. GOVERNING LAW</w:t>
       </w:r>
     </w:p>
@@ -3616,7 +3510,6 @@
           <w:sz w:val="20"/>
           <w:szCs w:val="20"/>
         </w:rPr>
-        <w:lastRenderedPageBreak/>
         <w:t xml:space="preserve">16.1 </w:t>
       </w:r>
       <w:r>
@@ -4041,7 +3934,6 @@
           <w:szCs w:val="20"/>
         </w:rPr>
       </w:pPr>
-      <w:proofErr w:type="gramStart"/>
       <w:r>
         <w:rPr>
           <w:rFonts w:ascii="Times New Roman" w:hAnsi="Times New Roman" w:cs="Times New Roman"/>
@@ -4050,7 +3942,6 @@
         </w:rPr>
         <w:t>electronically;</w:t>
       </w:r>
-      <w:proofErr w:type="gramEnd"/>
     </w:p>
     <w:p>
       <w:pPr>
@@ -4307,7 +4198,7 @@
           <w:sz w:val="20"/>
           <w:szCs w:val="20"/>
         </w:rPr>
-        <w:t>[Media Platform Name]</w:t>
+        <w:t>KINETOSCOPE FILMS PVT LTD</w:t>
       </w:r>
     </w:p>
     <w:p>
@@ -4434,7 +4325,7 @@
 </file>
 
 <file path=word/numbering.xml><?xml version="1.0" encoding="utf-8"?>
-<w:numbering xmlns:wpc="http://schemas.microsoft.com/office/word/2010/wordprocessingCanvas" xmlns:cx="http://schemas.microsoft.com/office/drawing/2014/chartex" xmlns:cx1="http://schemas.microsoft.com/office/drawing/2015/9/8/chartex" xmlns:cx2="http://schemas.microsoft.com/office/drawing/2015/10/21/chartex" xmlns:cx3="http://schemas.microsoft.com/office/drawing/2016/5/9/chartex" xmlns:cx4="http://schemas.microsoft.com/office/drawing/2016/5/10/chartex" xmlns:cx5="http://schemas.microsoft.com/office/drawing/2016/5/11/chartex" xmlns:cx6="http://schemas.microsoft.com/office/drawing/2016/5/12/chartex" xmlns:cx7="http://schemas.microsoft.com/office/drawing/2016/5/13/chartex" xmlns:cx8="http://schemas.microsoft.com/office/drawing/2016/5/14/chartex" xmlns:mc="http://schemas.openxmlformats.org/markup-compatibility/2006" xmlns:aink="http://schemas.microsoft.com/office/drawing/2016/ink" xmlns:am3d="http://schemas.microsoft.com/office/drawing/2017/model3d" xmlns:o="urn:schemas-microsoft-com:office:office" xmlns:oel="http://schemas.microsoft.com/office/2019/extlst" xmlns:r="http://schemas.openxmlformats.org/officeDocument/2006/relationships" xmlns:m="http://schemas.openxmlformats.org/officeDocument/2006/math" xmlns:v="urn:schemas-microsoft-com:vml" xmlns:wp14="http://schemas.microsoft.com/office/word/2010/wordprocessingDrawing" xmlns:wp="http://schemas.openxmlformats.org/drawingml/2006/wordprocessingDrawing" xmlns:w10="urn:schemas-microsoft-com:office:word" xmlns:w="http://schemas.openxmlformats.org/wordprocessingml/2006/main" xmlns:w14="http://schemas.microsoft.com/office/word/2010/wordml" xmlns:w15="http://schemas.microsoft.com/office/word/2012/wordml" xmlns:w16cex="http://schemas.microsoft.com/office/word/2018/wordml/cex" xmlns:w16cid="http://schemas.microsoft.com/office/word/2016/wordml/cid" xmlns:w16="http://schemas.microsoft.com/office/word/2018/wordml" xmlns:w16du="http://schemas.microsoft.com/office/word/2023/wordml/word16du" xmlns:w16sdtdh="http://schemas.microsoft.com/office/word/2020/wordml/sdtdatahash" xmlns:w16sdtfl="http://schemas.microsoft.com/office/word/2024/wordml/sdtformatlock" xmlns:w16se="http://schemas.microsoft.com/office/word/2015/wordml/symex" xmlns:wpg="http://schemas.microsoft.com/office/word/2010/wordprocessingGroup" xmlns:wpi="http://schemas.microsoft.com/office/word/2010/wordprocessingInk" xmlns:wne="http://schemas.microsoft.com/office/word/2006/wordml" xmlns:wps="http://schemas.microsoft.com/office/word/2010/wordprocessingShape" mc:Ignorable="w14 w15 w16se w16cid w16 w16cex w16sdtdh w16sdtfl w16du wp14">
+<w:numbering xmlns:wpc="http://schemas.microsoft.com/office/word/2010/wordprocessingCanvas" xmlns:cx="http://schemas.microsoft.com/office/drawing/2014/chartex" xmlns:cx1="http://schemas.microsoft.com/office/drawing/2015/9/8/chartex" xmlns:cx2="http://schemas.microsoft.com/office/drawing/2015/10/21/chartex" xmlns:cx3="http://schemas.microsoft.com/office/drawing/2016/5/9/chartex" xmlns:cx4="http://schemas.microsoft.com/office/drawing/2016/5/10/chartex" xmlns:cx5="http://schemas.microsoft.com/office/drawing/2016/5/11/chartex" xmlns:cx6="http://schemas.microsoft.com/office/drawing/2016/5/12/chartex" xmlns:cx7="http://schemas.microsoft.com/office/drawing/2016/5/13/chartex" xmlns:cx8="http://schemas.microsoft.com/office/drawing/2016/5/14/chartex" xmlns:mc="http://schemas.openxmlformats.org/markup-compatibility/2006" xmlns:aink="http://schemas.microsoft.com/office/drawing/2016/ink" xmlns:am3d="http://schemas.microsoft.com/office/drawing/2017/model3d" xmlns:o="urn:schemas-microsoft-com:office:office" xmlns:oel="http://schemas.microsoft.com/office/2019/extlst" xmlns:r="http://schemas.openxmlformats.org/officeDocument/2006/relationships" xmlns:m="http://schemas.openxmlformats.org/officeDocument/2006/math" xmlns:v="urn:schemas-microsoft-com:vml" xmlns:wp14="http://schemas.microsoft.com/office/word/2010/wordprocessingDrawing" xmlns:wp="http://schemas.openxmlformats.org/drawingml/2006/wordprocessingDrawing" xmlns:w10="urn:schemas-microsoft-com:office:word" xmlns:w="http://schemas.openxmlformats.org/wordprocessingml/2006/main" xmlns:w14="http://schemas.microsoft.com/office/word/2010/wordml" xmlns:w15="http://schemas.microsoft.com/office/word/2012/wordml" xmlns:w16cei="http://schemas.microsoft.com/office/word/2026/wordml/cei" xmlns:w16cex="http://schemas.microsoft.com/office/word/2018/wordml/cex" xmlns:w16cid="http://schemas.microsoft.com/office/word/2016/wordml/cid" xmlns:w16="http://schemas.microsoft.com/office/word/2018/wordml" xmlns:w16du="http://schemas.microsoft.com/office/word/2023/wordml/word16du" xmlns:w16sdtdh="http://schemas.microsoft.com/office/word/2020/wordml/sdtdatahash" xmlns:w16sdtfl="http://schemas.microsoft.com/office/word/2024/wordml/sdtformatlock" xmlns:w16se="http://schemas.microsoft.com/office/word/2015/wordml/symex" xmlns:wpg="http://schemas.microsoft.com/office/word/2010/wordprocessingGroup" xmlns:wpi="http://schemas.microsoft.com/office/word/2010/wordprocessingInk" xmlns:wne="http://schemas.microsoft.com/office/word/2006/wordml" xmlns:wps="http://schemas.microsoft.com/office/word/2010/wordprocessingShape" mc:Ignorable="w14 w15 w16se w16cid w16 w16cex w16sdtdh w16sdtfl w16du wp14">
   <w:abstractNum w:abstractNumId="0" w15:restartNumberingAfterBreak="0">
     <w:nsid w:val="07324AD6"/>
     <w:multiLevelType w:val="multilevel"/>

</xml_diff>